<commit_message>
Court letter: optional red case number (คดีหมายเลขแดงที่ … only when filled); field moved into the court popup
Co-Authored-By: Claude Opus 5 <noreply@anthropic.com>
</commit_message>
<xml_diff>
--- a/build/court_referral_template.docx
+++ b/build/court_referral_template.docx
@@ -384,7 +384,7 @@
           <w:rFonts w:ascii="TH SarabunIT๙" w:hAnsi="TH SarabunIT๙" w:cs="TH SarabunIT๙"/>
           <w:cs/>
         </w:rPr>
-        <w:t>จับตามหมายจับของ{court_name} ที่ {warrant_no} คดีหมายเลขดำที่ {case_black_no} ลงวันที่ {warrant_date} ในความผิดฐาน “{charge}”</w:t>
+        <w:t>จับตามหมายจับของ{court_name} ที่ {warrant_no} คดีหมายเลขดำที่ {case_black_no}{case_red_clause} ลงวันที่ {warrant_date} ในความผิดฐาน “{charge}”</w:t>
       </w:r>
       <w:r>
         <w:rPr>
@@ -771,7 +771,7 @@
           <w:rFonts w:ascii="TH SarabunIT๙" w:hAnsi="TH SarabunIT๙" w:cs="TH SarabunIT๙"/>
           <w:cs/>
         </w:rPr>
-        <w:t>ด้วยเมื่อวันที่ {warrant_date} {court_name} ที่ {warrant_no} คดีหมายเลขดำที่ {case_black_no} ลงวันที่ {warrant_date} ในความผิดฐาน {charge}นั้น</w:t>
+        <w:t>ด้วยเมื่อวันที่ {warrant_date} {court_name} ที่ {warrant_no} คดีหมายเลขดำที่ {case_black_no}{case_red_clause} ลงวันที่ {warrant_date} ในความผิดฐาน {charge}นั้น</w:t>
       </w:r>
       <w:r>
         <w:rPr>

</xml_diff>

<commit_message>
Court letter: สิ่งที่ส่งมาด้วย back inline after the charge, regular weight, exactly as the station form
Co-Authored-By: Claude Opus 5 <noreply@anthropic.com>
</commit_message>
<xml_diff>
--- a/build/court_referral_template.docx
+++ b/build/court_referral_template.docx
@@ -384,208 +384,7 @@
           <w:rFonts w:ascii="TH SarabunIT๙" w:hAnsi="TH SarabunIT๙" w:cs="TH SarabunIT๙"/>
           <w:cs/>
         </w:rPr>
-        <w:t>จับตามหมายจับของ{court_name} ที่ {warrant_no} คดีหมายเลขดำที่ {case_black_no}{case_red_clause} ลงวันที่ {warrant_date} ในความผิดฐาน “{charge}”</w:t>
-      </w:r>
-      <w:r>
-        <w:rPr>
-          <w:rFonts w:ascii="TH SarabunIT๙" w:hAnsi="TH SarabunIT๙" w:cs="TH SarabunIT๙"/>
-          <w:cs/>
-        </w:rPr>
-      </w:r>
-      <w:r>
-        <w:rPr>
-          <w:rFonts w:ascii="TH SarabunIT๙" w:hAnsi="TH SarabunIT๙" w:cs="TH SarabunIT๙" w:hint="cs"/>
-          <w:cs/>
-        </w:rPr>
-      </w:r>
-      <w:r>
-        <w:rPr>
-          <w:rFonts w:ascii="TH SarabunIT๙" w:hAnsi="TH SarabunIT๙" w:cs="TH SarabunIT๙"/>
-          <w:cs/>
-        </w:rPr>
-      </w:r>
-      <w:r>
-        <w:rPr>
-          <w:rFonts w:ascii="TH SarabunIT๙" w:hAnsi="TH SarabunIT๙" w:cs="TH SarabunIT๙" w:hint="cs"/>
-          <w:cs/>
-        </w:rPr>
-      </w:r>
-      <w:r>
-        <w:rPr>
-          <w:rFonts w:ascii="TH SarabunIT๙" w:hAnsi="TH SarabunIT๙" w:cs="TH SarabunIT๙" w:hint="cs"/>
-          <w:cs/>
-        </w:rPr>
-      </w:r>
-      <w:r>
-        <w:rPr>
-          <w:rFonts w:ascii="TH SarabunIT๙" w:hAnsi="TH SarabunIT๙" w:cs="TH SarabunIT๙"/>
-          <w:cs/>
-        </w:rPr>
-      </w:r>
-      <w:proofErr w:type="spellStart"/>
-      <w:r>
-        <w:rPr>
-          <w:rFonts w:ascii="TH SarabunIT๙" w:hAnsi="TH SarabunIT๙" w:cs="TH SarabunIT๙" w:hint="cs"/>
-          <w:cs/>
-        </w:rPr>
-      </w:r>
-      <w:proofErr w:type="spellEnd"/>
-      <w:r>
-        <w:rPr>
-          <w:rFonts w:ascii="TH SarabunIT๙" w:hAnsi="TH SarabunIT๙" w:cs="TH SarabunIT๙" w:hint="cs"/>
-          <w:cs/>
-        </w:rPr>
-      </w:r>
-      <w:r>
-        <w:rPr>
-          <w:rFonts w:ascii="TH SarabunIT๙" w:hAnsi="TH SarabunIT๙" w:cs="TH SarabunIT๙"/>
-          <w:cs/>
-        </w:rPr>
-      </w:r>
-      <w:r>
-        <w:rPr>
-          <w:rFonts w:ascii="TH SarabunIT๙" w:hAnsi="TH SarabunIT๙" w:cs="TH SarabunIT๙" w:hint="cs"/>
-          <w:cs/>
-        </w:rPr>
-      </w:r>
-      <w:r>
-        <w:rPr>
-          <w:rFonts w:ascii="TH SarabunIT๙" w:hAnsi="TH SarabunIT๙" w:cs="TH SarabunIT๙"/>
-          <w:cs/>
-        </w:rPr>
-      </w:r>
-      <w:r>
-        <w:rPr>
-          <w:rFonts w:ascii="TH SarabunIT๙" w:hAnsi="TH SarabunIT๙" w:cs="TH SarabunIT๙" w:hint="cs"/>
-          <w:cs/>
-        </w:rPr>
-      </w:r>
-      <w:r>
-        <w:rPr>
-          <w:rFonts w:ascii="TH SarabunIT๙" w:hAnsi="TH SarabunIT๙" w:cs="TH SarabunIT๙"/>
-          <w:cs/>
-        </w:rPr>
-      </w:r>
-      <w:r>
-        <w:rPr>
-          <w:rFonts w:ascii="TH SarabunIT๙" w:hAnsi="TH SarabunIT๙" w:cs="TH SarabunIT๙" w:hint="cs"/>
-          <w:cs/>
-        </w:rPr>
-      </w:r>
-      <w:r>
-        <w:rPr>
-          <w:rFonts w:ascii="TH SarabunIT๙" w:hAnsi="TH SarabunIT๙" w:cs="TH SarabunIT๙"/>
-          <w:cs/>
-        </w:rPr>
-      </w:r>
-      <w:r>
-        <w:rPr>
-          <w:rFonts w:ascii="TH SarabunIT๙" w:hAnsi="TH SarabunIT๙" w:cs="TH SarabunIT๙" w:hint="cs"/>
-          <w:cs/>
-        </w:rPr>
-      </w:r>
-      <w:r>
-        <w:rPr>
-          <w:rFonts w:ascii="TH SarabunIT๙" w:hAnsi="TH SarabunIT๙" w:cs="TH SarabunIT๙" w:hint="cs"/>
-          <w:cs/>
-        </w:rPr>
-      </w:r>
-      <w:r>
-        <w:rPr>
-          <w:rFonts w:ascii="TH SarabunIT๙" w:hAnsi="TH SarabunIT๙" w:cs="TH SarabunIT๙"/>
-          <w:cs/>
-        </w:rPr>
-      </w:r>
-      <w:r>
-        <w:rPr>
-          <w:rFonts w:ascii="TH SarabunIT๙" w:hAnsi="TH SarabunIT๙" w:cs="TH SarabunIT๙"/>
-        </w:rPr>
-      </w:r>
-      <w:r>
-        <w:rPr>
-          <w:rFonts w:ascii="TH SarabunIT๙" w:hAnsi="TH SarabunIT๙" w:cs="TH SarabunIT๙" w:hint="cs"/>
-          <w:cs/>
-        </w:rPr>
-      </w:r>
-      <w:r>
-        <w:rPr>
-          <w:rFonts w:ascii="TH SarabunIT๙" w:hAnsi="TH SarabunIT๙" w:cs="TH SarabunIT๙"/>
-        </w:rPr>
-      </w:r>
-      <w:r>
-        <w:rPr>
-          <w:rFonts w:ascii="TH SarabunIT๙" w:hAnsi="TH SarabunIT๙" w:cs="TH SarabunIT๙" w:hint="cs"/>
-          <w:cs/>
-        </w:rPr>
-      </w:r>
-      <w:proofErr w:type="spellStart"/>
-      <w:r>
-        <w:rPr>
-          <w:rFonts w:ascii="TH SarabunIT๙" w:hAnsi="TH SarabunIT๙" w:cs="TH SarabunIT๙" w:hint="cs"/>
-          <w:cs/>
-        </w:rPr>
-      </w:r>
-      <w:proofErr w:type="spellEnd"/>
-      <w:r>
-        <w:rPr>
-          <w:rFonts w:ascii="TH SarabunIT๙" w:hAnsi="TH SarabunIT๙" w:cs="TH SarabunIT๙" w:hint="cs"/>
-          <w:cs/>
-        </w:rPr>
-      </w:r>
-      <w:r>
-        <w:rPr>
-          <w:rFonts w:ascii="TH SarabunIT๙" w:hAnsi="TH SarabunIT๙" w:cs="TH SarabunIT๙"/>
-        </w:rPr>
-      </w:r>
-      <w:r>
-        <w:rPr>
-          <w:rFonts w:ascii="TH SarabunIT๙" w:hAnsi="TH SarabunIT๙" w:cs="TH SarabunIT๙" w:hint="cs"/>
-          <w:cs/>
-        </w:rPr>
-      </w:r>
-      <w:r>
-        <w:rPr>
-          <w:rFonts w:ascii="TH SarabunIT๙" w:hAnsi="TH SarabunIT๙" w:cs="TH SarabunIT๙"/>
-          <w:cs/>
-        </w:rPr>
-      </w:r>
-      <w:r>
-        <w:rPr>
-          <w:rFonts w:ascii="TH SarabunIT๙" w:eastAsia="Cordia New" w:hAnsi="TH SarabunIT๙" w:cs="TH SarabunIT๙"/>
-          <w:cs/>
-        </w:rPr>
-      </w:r>
-    </w:p>
-    <w:p>
-      <w:pPr>
-        <w:spacing w:before="0"/>
-        <w:jc w:val="thaiDistribute"/>
-        <w:rPr>
-          <w:rFonts w:ascii="TH SarabunIT๙" w:hAnsi="TH SarabunIT๙" w:cs="TH SarabunIT๙"/>
-        </w:rPr>
-      </w:pPr>
-      <w:r>
-        <w:rPr>
-          <w:rFonts w:ascii="TH SarabunIT๙" w:hAnsi="TH SarabunIT๙" w:cs="TH SarabunIT๙"/>
-          <w:b/>
-          <w:bCs/>
-          <w:cs/>
-        </w:rPr>
-        <w:t>สิ่งที่ส่งมาด้วย</w:t>
-      </w:r>
-      <w:r>
-        <w:rPr>
-          <w:rFonts w:ascii="TH SarabunIT๙" w:hAnsi="TH SarabunIT๙" w:cs="TH SarabunIT๙"/>
-          <w:cs/>
-        </w:rPr>
-        <w:t xml:space="preserve">  </w:t>
-      </w:r>
-      <w:r>
-        <w:rPr>
-          <w:rFonts w:ascii="TH SarabunIT๙" w:hAnsi="TH SarabunIT๙" w:cs="TH SarabunIT๙"/>
-          <w:cs/>
-        </w:rPr>
-        <w:t>บันทึกจับกุมตัว จำนวน ๑ ฉบับ</w:t>
+        <w:t>จับตามหมายจับของ{court_name} ที่ {warrant_no} คดีหมายเลขดำที่ {case_black_no}{case_red_clause} ลงวันที่ {warrant_date} ในความผิดฐาน “{charge}”สิ่งที่ส่งมาด้วย  บันทึกจับกุมตัว จำนวน ๑ ฉบับ</w:t>
       </w:r>
       <w:r>
         <w:rPr>

</xml_diff>